<commit_message>
Updating to 2026 field season
</commit_message>
<xml_diff>
--- a/SFAN_SNPLPORE_DRR_Template.docx
+++ b/SFAN_SNPLPORE_DRR_Template.docx
@@ -2129,21 +2129,17 @@
     <w:p>
       <w:pPr>
         <w:pStyle w:val="SourceCode"/>
-      </w:pPr>
-      <w:proofErr w:type="spellStart"/>
+        <w:spacing w:after="0"/>
+        <w:rPr>
+          <w:rStyle w:val="VerbatimChar"/>
+        </w:rPr>
+      </w:pPr>
       <w:proofErr w:type="gramStart"/>
       <w:r>
         <w:rPr>
           <w:rStyle w:val="VerbatimChar"/>
         </w:rPr>
-        <w:t>devtools</w:t>
-      </w:r>
-      <w:proofErr w:type="spellEnd"/>
-      <w:r>
-        <w:rPr>
-          <w:rStyle w:val="VerbatimChar"/>
-        </w:rPr>
-        <w:t>::</w:t>
+        <w:t>remotes::</w:t>
       </w:r>
       <w:proofErr w:type="spellStart"/>
       <w:proofErr w:type="gramEnd"/>
@@ -2158,14 +2154,14 @@
         <w:rPr>
           <w:rStyle w:val="VerbatimChar"/>
         </w:rPr>
-        <w:t>('</w:t>
+        <w:t>("</w:t>
       </w:r>
       <w:proofErr w:type="spellStart"/>
       <w:r>
         <w:rPr>
           <w:rStyle w:val="VerbatimChar"/>
         </w:rPr>
-        <w:t>nationalparkservice</w:t>
+        <w:t>doi-nps</w:t>
       </w:r>
       <w:proofErr w:type="spellEnd"/>
       <w:r>
@@ -2186,11 +2182,14 @@
         <w:rPr>
           <w:rStyle w:val="VerbatimChar"/>
         </w:rPr>
-        <w:t>')</w:t>
-      </w:r>
-      <w:r>
-        <w:br/>
-      </w:r>
+        <w:t>")</w:t>
+      </w:r>
+    </w:p>
+    <w:p>
+      <w:pPr>
+        <w:pStyle w:val="SourceCode"/>
+        <w:spacing w:after="0"/>
+      </w:pPr>
       <w:proofErr w:type="spellStart"/>
       <w:proofErr w:type="gramStart"/>
       <w:r>
@@ -2414,11 +2413,9 @@
         <w:lastRenderedPageBreak/>
         <w:t>birds/</w:t>
       </w:r>
-      <w:proofErr w:type="gramStart"/>
-      <w:r>
-        <w:t>flushing, and</w:t>
-      </w:r>
-      <w:proofErr w:type="gramEnd"/>
+      <w:r>
+        <w:t>flushing and</w:t>
+      </w:r>
       <w:r>
         <w:t xml:space="preserve"> continue their 50-100 m walking intervals along the shoreline of the survey area.</w:t>
       </w:r>
@@ -3923,7 +3920,6 @@
   <w:style w:type="character" w:default="1" w:styleId="DefaultParagraphFont">
     <w:name w:val="Default Paragraph Font"/>
     <w:uiPriority w:val="1"/>
-    <w:semiHidden/>
     <w:unhideWhenUsed/>
   </w:style>
   <w:style w:type="table" w:default="1" w:styleId="TableNormal">
@@ -5059,6 +5055,26 @@
 </file>
 
 <file path=customXml/item1.xml><?xml version="1.0" encoding="utf-8"?>
+<p:properties xmlns:p="http://schemas.microsoft.com/office/2006/metadata/properties" xmlns:xsi="http://www.w3.org/2001/XMLSchema-instance" xmlns:pc="http://schemas.microsoft.com/office/infopath/2007/PartnerControls">
+  <documentManagement>
+    <lcf76f155ced4ddcb4097134ff3c332f xmlns="ad085b6c-7437-411b-8b38-47c968abd347">
+      <Terms xmlns="http://schemas.microsoft.com/office/infopath/2007/PartnerControls"/>
+    </lcf76f155ced4ddcb4097134ff3c332f>
+    <TaxCatchAll xmlns="31062a0d-ede8-4112-b4bb-00a9c1bc8e16" xsi:nil="true"/>
+  </documentManagement>
+</p:properties>
+</file>
+
+<file path=customXml/item2.xml><?xml version="1.0" encoding="utf-8"?>
+<?mso-contentType ?>
+<FormTemplates xmlns="http://schemas.microsoft.com/sharepoint/v3/contenttype/forms">
+  <Display>DocumentLibraryForm</Display>
+  <Edit>DocumentLibraryForm</Edit>
+  <New>DocumentLibraryForm</New>
+</FormTemplates>
+</file>
+
+<file path=customXml/item3.xml><?xml version="1.0" encoding="utf-8"?>
 <ct:contentTypeSchema xmlns:ct="http://schemas.microsoft.com/office/2006/metadata/contentType" xmlns:ma="http://schemas.microsoft.com/office/2006/metadata/properties/metaAttributes" ct:_="" ma:_="" ma:contentTypeName="Document" ma:contentTypeID="0x010100082CD3E31919CD4D8655811E15D5BC27" ma:contentTypeVersion="15" ma:contentTypeDescription="Create a new document." ma:contentTypeScope="" ma:versionID="729ac04ea1630219c040c2ff78caacb6">
   <xsd:schema xmlns:xsd="http://www.w3.org/2001/XMLSchema" xmlns:xs="http://www.w3.org/2001/XMLSchema" xmlns:p="http://schemas.microsoft.com/office/2006/metadata/properties" xmlns:ns2="ad085b6c-7437-411b-8b38-47c968abd347" xmlns:ns3="4671cff1-bb98-4362-b999-0807e48a599e" xmlns:ns4="31062a0d-ede8-4112-b4bb-00a9c1bc8e16" targetNamespace="http://schemas.microsoft.com/office/2006/metadata/properties" ma:root="true" ma:fieldsID="241d4379ad00e4ac2cac03ddcde72730" ns2:_="" ns3:_="" ns4:_="">
     <xsd:import namespace="ad085b6c-7437-411b-8b38-47c968abd347"/>
@@ -5298,27 +5314,26 @@
 </ct:contentTypeSchema>
 </file>
 
-<file path=customXml/item2.xml><?xml version="1.0" encoding="utf-8"?>
-<?mso-contentType ?>
-<FormTemplates xmlns="http://schemas.microsoft.com/sharepoint/v3/contenttype/forms">
-  <Display>DocumentLibraryForm</Display>
-  <Edit>DocumentLibraryForm</Edit>
-  <New>DocumentLibraryForm</New>
-</FormTemplates>
+<file path=customXml/itemProps1.xml><?xml version="1.0" encoding="utf-8"?>
+<ds:datastoreItem xmlns:ds="http://schemas.openxmlformats.org/officeDocument/2006/customXml" ds:itemID="{91F9EDDB-208F-4099-BB03-B0E33B4BAF4C}">
+  <ds:schemaRefs>
+    <ds:schemaRef ds:uri="http://schemas.microsoft.com/office/2006/metadata/properties"/>
+    <ds:schemaRef ds:uri="http://schemas.microsoft.com/office/infopath/2007/PartnerControls"/>
+    <ds:schemaRef ds:uri="ad085b6c-7437-411b-8b38-47c968abd347"/>
+    <ds:schemaRef ds:uri="31062a0d-ede8-4112-b4bb-00a9c1bc8e16"/>
+  </ds:schemaRefs>
+</ds:datastoreItem>
 </file>
 
-<file path=customXml/item3.xml><?xml version="1.0" encoding="utf-8"?>
-<p:properties xmlns:p="http://schemas.microsoft.com/office/2006/metadata/properties" xmlns:xsi="http://www.w3.org/2001/XMLSchema-instance" xmlns:pc="http://schemas.microsoft.com/office/infopath/2007/PartnerControls">
-  <documentManagement>
-    <lcf76f155ced4ddcb4097134ff3c332f xmlns="ad085b6c-7437-411b-8b38-47c968abd347">
-      <Terms xmlns="http://schemas.microsoft.com/office/infopath/2007/PartnerControls"/>
-    </lcf76f155ced4ddcb4097134ff3c332f>
-    <TaxCatchAll xmlns="31062a0d-ede8-4112-b4bb-00a9c1bc8e16" xsi:nil="true"/>
-  </documentManagement>
-</p:properties>
+<file path=customXml/itemProps2.xml><?xml version="1.0" encoding="utf-8"?>
+<ds:datastoreItem xmlns:ds="http://schemas.openxmlformats.org/officeDocument/2006/customXml" ds:itemID="{1574FA4D-C623-4478-BD29-C9A7DCE7A61F}">
+  <ds:schemaRefs>
+    <ds:schemaRef ds:uri="http://schemas.microsoft.com/sharepoint/v3/contenttype/forms"/>
+  </ds:schemaRefs>
+</ds:datastoreItem>
 </file>
 
-<file path=customXml/itemProps1.xml><?xml version="1.0" encoding="utf-8"?>
+<file path=customXml/itemProps3.xml><?xml version="1.0" encoding="utf-8"?>
 <ds:datastoreItem xmlns:ds="http://schemas.openxmlformats.org/officeDocument/2006/customXml" ds:itemID="{9C72E5BE-70BD-49BD-B0FF-C90E276FBC07}">
   <ds:schemaRefs>
     <ds:schemaRef ds:uri="http://schemas.microsoft.com/office/2006/metadata/contentType"/>
@@ -5338,25 +5353,6 @@
 </ds:datastoreItem>
 </file>
 
-<file path=customXml/itemProps2.xml><?xml version="1.0" encoding="utf-8"?>
-<ds:datastoreItem xmlns:ds="http://schemas.openxmlformats.org/officeDocument/2006/customXml" ds:itemID="{1574FA4D-C623-4478-BD29-C9A7DCE7A61F}">
-  <ds:schemaRefs>
-    <ds:schemaRef ds:uri="http://schemas.microsoft.com/sharepoint/v3/contenttype/forms"/>
-  </ds:schemaRefs>
-</ds:datastoreItem>
-</file>
-
-<file path=customXml/itemProps3.xml><?xml version="1.0" encoding="utf-8"?>
-<ds:datastoreItem xmlns:ds="http://schemas.openxmlformats.org/officeDocument/2006/customXml" ds:itemID="{91F9EDDB-208F-4099-BB03-B0E33B4BAF4C}">
-  <ds:schemaRefs>
-    <ds:schemaRef ds:uri="http://schemas.microsoft.com/office/2006/metadata/properties"/>
-    <ds:schemaRef ds:uri="http://schemas.microsoft.com/office/infopath/2007/PartnerControls"/>
-    <ds:schemaRef ds:uri="ad085b6c-7437-411b-8b38-47c968abd347"/>
-    <ds:schemaRef ds:uri="31062a0d-ede8-4112-b4bb-00a9c1bc8e16"/>
-  </ds:schemaRefs>
-</ds:datastoreItem>
-</file>
-
 <file path=docMetadata/LabelInfo.xml><?xml version="1.0" encoding="utf-8"?>
 <clbl:labelList xmlns:clbl="http://schemas.microsoft.com/office/2020/mipLabelMetadata">
   <clbl:label id="{6dd02d64-b7f3-43f7-a145-cfd68d338edf}" enabled="1" method="Standard" siteId="{0693b5ba-4b18-4d7b-9341-f32f400a5494}" contentBits="0" removed="0"/>

</xml_diff>